<commit_message>
Penambahan file pertemuan 4
</commit_message>
<xml_diff>
--- a/Laporan/Laporan_Modul03_23051430011.docx
+++ b/Laporan/Laporan_Modul03_23051430011.docx
@@ -4585,7 +4585,8 @@
     </w:p>
     <w:tbl>
       <w:tblPr>
-        <w:tblW w:w="9360" w:type="dxa"/>
+        <w:tblW w:w="10298" w:type="dxa"/>
+        <w:tblInd w:w="-672" w:type="dxa"/>
         <w:tblBorders>
           <w:top w:val="single" w:sz="4" w:space="0" w:color="auto"/>
           <w:left w:val="single" w:sz="4" w:space="0" w:color="auto"/>
@@ -4609,7 +4610,7 @@
         </w:trPr>
         <w:tc>
           <w:tcPr>
-            <w:tcW w:w="9360" w:type="dxa"/>
+            <w:tcW w:w="10298" w:type="dxa"/>
             <w:tcBorders>
               <w:top w:val="single" w:sz="6" w:space="0" w:color="2C5F8A"/>
               <w:left w:val="single" w:sz="6" w:space="0" w:color="2C5F8A"/>
@@ -4946,6 +4947,7 @@
               <w:t xml:space="preserve">[ Tempel Screenshot di </w:t>
             </w:r>
             <w:proofErr w:type="spellStart"/>
+            <w:proofErr w:type="gramStart"/>
             <w:r>
               <w:rPr>
                 <w:color w:val="AAAAAA"/>
@@ -4963,6 +4965,7 @@
               </w:rPr>
               <w:t xml:space="preserve"> ]</w:t>
             </w:r>
+            <w:proofErr w:type="gramEnd"/>
           </w:p>
           <w:p>
             <w:pPr>
@@ -9540,6 +9543,7 @@
               </w:rPr>
             </w:pPr>
             <w:proofErr w:type="spellStart"/>
+            <w:proofErr w:type="gramStart"/>
             <w:r>
               <w:rPr>
                 <w:rFonts w:ascii="Courier New" w:eastAsia="Courier New" w:hAnsi="Courier New" w:cs="Courier New"/>
@@ -9551,6 +9555,7 @@
               <w:t>button:hover</w:t>
             </w:r>
             <w:proofErr w:type="spellEnd"/>
+            <w:proofErr w:type="gramEnd"/>
             <w:r>
               <w:rPr>
                 <w:rFonts w:ascii="Courier New" w:eastAsia="Courier New" w:hAnsi="Courier New" w:cs="Courier New"/>
@@ -9580,7 +9585,29 @@
                 <w:szCs w:val="18"/>
                 <w:lang w:val="en-US"/>
               </w:rPr>
-              <w:t>    background-color: #219150; /*</w:t>
+              <w:t>    background-</w:t>
+            </w:r>
+            <w:proofErr w:type="gramStart"/>
+            <w:r>
+              <w:rPr>
+                <w:rFonts w:ascii="Courier New" w:eastAsia="Courier New" w:hAnsi="Courier New" w:cs="Courier New"/>
+                <w:color w:val="D4D4D4"/>
+                <w:sz w:val="18"/>
+                <w:szCs w:val="18"/>
+                <w:lang w:val="en-US"/>
+              </w:rPr>
+              <w:t>color: #</w:t>
+            </w:r>
+            <w:proofErr w:type="gramEnd"/>
+            <w:r>
+              <w:rPr>
+                <w:rFonts w:ascii="Courier New" w:eastAsia="Courier New" w:hAnsi="Courier New" w:cs="Courier New"/>
+                <w:color w:val="D4D4D4"/>
+                <w:sz w:val="18"/>
+                <w:szCs w:val="18"/>
+                <w:lang w:val="en-US"/>
+              </w:rPr>
+              <w:t>219150; /*</w:t>
             </w:r>
             <w:proofErr w:type="spellStart"/>
             <w:r>
@@ -12503,7 +12530,29 @@
                 <w:szCs w:val="18"/>
                 <w:lang w:val="en-US"/>
               </w:rPr>
-              <w:t>    &lt;!-- Bootstrap 5 CDN --&gt;</w:t>
+              <w:t xml:space="preserve">    </w:t>
+            </w:r>
+            <w:proofErr w:type="gramStart"/>
+            <w:r>
+              <w:rPr>
+                <w:rFonts w:ascii="Courier New" w:eastAsia="Courier New" w:hAnsi="Courier New" w:cs="Courier New"/>
+                <w:color w:val="D4D4D4"/>
+                <w:sz w:val="18"/>
+                <w:szCs w:val="18"/>
+                <w:lang w:val="en-US"/>
+              </w:rPr>
+              <w:t>&lt;!--</w:t>
+            </w:r>
+            <w:proofErr w:type="gramEnd"/>
+            <w:r>
+              <w:rPr>
+                <w:rFonts w:ascii="Courier New" w:eastAsia="Courier New" w:hAnsi="Courier New" w:cs="Courier New"/>
+                <w:color w:val="D4D4D4"/>
+                <w:sz w:val="18"/>
+                <w:szCs w:val="18"/>
+                <w:lang w:val="en-US"/>
+              </w:rPr>
+              <w:t xml:space="preserve"> Bootstrap 5 CDN --&gt;</w:t>
             </w:r>
           </w:p>
           <w:p>
@@ -12623,15 +12672,27 @@
                 <w:lang w:val="en-US"/>
               </w:rPr>
             </w:pPr>
-            <w:r>
-              <w:rPr>
-                <w:rFonts w:ascii="Courier New" w:eastAsia="Courier New" w:hAnsi="Courier New" w:cs="Courier New"/>
-                <w:color w:val="D4D4D4"/>
-                <w:sz w:val="18"/>
-                <w:szCs w:val="18"/>
-                <w:lang w:val="en-US"/>
-              </w:rPr>
-              <w:t>&lt;!-- Navbar --&gt;</w:t>
+            <w:proofErr w:type="gramStart"/>
+            <w:r>
+              <w:rPr>
+                <w:rFonts w:ascii="Courier New" w:eastAsia="Courier New" w:hAnsi="Courier New" w:cs="Courier New"/>
+                <w:color w:val="D4D4D4"/>
+                <w:sz w:val="18"/>
+                <w:szCs w:val="18"/>
+                <w:lang w:val="en-US"/>
+              </w:rPr>
+              <w:t>&lt;!--</w:t>
+            </w:r>
+            <w:proofErr w:type="gramEnd"/>
+            <w:r>
+              <w:rPr>
+                <w:rFonts w:ascii="Courier New" w:eastAsia="Courier New" w:hAnsi="Courier New" w:cs="Courier New"/>
+                <w:color w:val="D4D4D4"/>
+                <w:sz w:val="18"/>
+                <w:szCs w:val="18"/>
+                <w:lang w:val="en-US"/>
+              </w:rPr>
+              <w:t xml:space="preserve"> Navbar --&gt;</w:t>
             </w:r>
           </w:p>
           <w:p>
@@ -12730,15 +12791,27 @@
               <w:t>href</w:t>
             </w:r>
             <w:proofErr w:type="spellEnd"/>
-            <w:r>
-              <w:rPr>
-                <w:rFonts w:ascii="Courier New" w:eastAsia="Courier New" w:hAnsi="Courier New" w:cs="Courier New"/>
-                <w:color w:val="D4D4D4"/>
-                <w:sz w:val="18"/>
-                <w:szCs w:val="18"/>
-                <w:lang w:val="en-US"/>
-              </w:rPr>
-              <w:t>="#"&gt;</w:t>
+            <w:proofErr w:type="gramStart"/>
+            <w:r>
+              <w:rPr>
+                <w:rFonts w:ascii="Courier New" w:eastAsia="Courier New" w:hAnsi="Courier New" w:cs="Courier New"/>
+                <w:color w:val="D4D4D4"/>
+                <w:sz w:val="18"/>
+                <w:szCs w:val="18"/>
+                <w:lang w:val="en-US"/>
+              </w:rPr>
+              <w:t>="#"</w:t>
+            </w:r>
+            <w:proofErr w:type="gramEnd"/>
+            <w:r>
+              <w:rPr>
+                <w:rFonts w:ascii="Courier New" w:eastAsia="Courier New" w:hAnsi="Courier New" w:cs="Courier New"/>
+                <w:color w:val="D4D4D4"/>
+                <w:sz w:val="18"/>
+                <w:szCs w:val="18"/>
+                <w:lang w:val="en-US"/>
+              </w:rPr>
+              <w:t>&gt;</w:t>
             </w:r>
             <w:proofErr w:type="spellStart"/>
             <w:r>
@@ -12866,7 +12939,29 @@
                 <w:szCs w:val="18"/>
                 <w:lang w:val="en-US"/>
               </w:rPr>
-              <w:t xml:space="preserve">    &lt;!-- </w:t>
+              <w:t xml:space="preserve">    </w:t>
+            </w:r>
+            <w:proofErr w:type="gramStart"/>
+            <w:r>
+              <w:rPr>
+                <w:rFonts w:ascii="Courier New" w:eastAsia="Courier New" w:hAnsi="Courier New" w:cs="Courier New"/>
+                <w:color w:val="D4D4D4"/>
+                <w:sz w:val="18"/>
+                <w:szCs w:val="18"/>
+                <w:lang w:val="en-US"/>
+              </w:rPr>
+              <w:t>&lt;!--</w:t>
+            </w:r>
+            <w:proofErr w:type="gramEnd"/>
+            <w:r>
+              <w:rPr>
+                <w:rFonts w:ascii="Courier New" w:eastAsia="Courier New" w:hAnsi="Courier New" w:cs="Courier New"/>
+                <w:color w:val="D4D4D4"/>
+                <w:sz w:val="18"/>
+                <w:szCs w:val="18"/>
+                <w:lang w:val="en-US"/>
+              </w:rPr>
+              <w:t xml:space="preserve"> </w:t>
             </w:r>
             <w:proofErr w:type="spellStart"/>
             <w:r>
@@ -13068,7 +13163,29 @@
                 <w:szCs w:val="18"/>
                 <w:lang w:val="en-US"/>
               </w:rPr>
-              <w:t>    &lt;!-- Layout Grid --&gt;</w:t>
+              <w:t xml:space="preserve">    </w:t>
+            </w:r>
+            <w:proofErr w:type="gramStart"/>
+            <w:r>
+              <w:rPr>
+                <w:rFonts w:ascii="Courier New" w:eastAsia="Courier New" w:hAnsi="Courier New" w:cs="Courier New"/>
+                <w:color w:val="D4D4D4"/>
+                <w:sz w:val="18"/>
+                <w:szCs w:val="18"/>
+                <w:lang w:val="en-US"/>
+              </w:rPr>
+              <w:t>&lt;!--</w:t>
+            </w:r>
+            <w:proofErr w:type="gramEnd"/>
+            <w:r>
+              <w:rPr>
+                <w:rFonts w:ascii="Courier New" w:eastAsia="Courier New" w:hAnsi="Courier New" w:cs="Courier New"/>
+                <w:color w:val="D4D4D4"/>
+                <w:sz w:val="18"/>
+                <w:szCs w:val="18"/>
+                <w:lang w:val="en-US"/>
+              </w:rPr>
+              <w:t xml:space="preserve"> Layout Grid --&gt;</w:t>
             </w:r>
           </w:p>
           <w:p>
@@ -13270,7 +13387,29 @@
                 <w:szCs w:val="18"/>
                 <w:lang w:val="en-US"/>
               </w:rPr>
-              <w:t>                    Form Stok Masuk</w:t>
+              <w:t xml:space="preserve">                    </w:t>
+            </w:r>
+            <w:proofErr w:type="gramStart"/>
+            <w:r>
+              <w:rPr>
+                <w:rFonts w:ascii="Courier New" w:eastAsia="Courier New" w:hAnsi="Courier New" w:cs="Courier New"/>
+                <w:color w:val="D4D4D4"/>
+                <w:sz w:val="18"/>
+                <w:szCs w:val="18"/>
+                <w:lang w:val="en-US"/>
+              </w:rPr>
+              <w:t>Form</w:t>
+            </w:r>
+            <w:proofErr w:type="gramEnd"/>
+            <w:r>
+              <w:rPr>
+                <w:rFonts w:ascii="Courier New" w:eastAsia="Courier New" w:hAnsi="Courier New" w:cs="Courier New"/>
+                <w:color w:val="D4D4D4"/>
+                <w:sz w:val="18"/>
+                <w:szCs w:val="18"/>
+                <w:lang w:val="en-US"/>
+              </w:rPr>
+              <w:t xml:space="preserve"> Stok Masuk</w:t>
             </w:r>
           </w:p>
           <w:p>
@@ -15500,15 +15639,27 @@
                 <w:lang w:val="en-US"/>
               </w:rPr>
             </w:pPr>
-            <w:r>
-              <w:rPr>
-                <w:rFonts w:ascii="Courier New" w:eastAsia="Courier New" w:hAnsi="Courier New" w:cs="Courier New"/>
-                <w:color w:val="D4D4D4"/>
-                <w:sz w:val="18"/>
-                <w:szCs w:val="18"/>
-                <w:lang w:val="en-US"/>
-              </w:rPr>
-              <w:t>&lt;!-- Bootstrap JS --&gt;</w:t>
+            <w:proofErr w:type="gramStart"/>
+            <w:r>
+              <w:rPr>
+                <w:rFonts w:ascii="Courier New" w:eastAsia="Courier New" w:hAnsi="Courier New" w:cs="Courier New"/>
+                <w:color w:val="D4D4D4"/>
+                <w:sz w:val="18"/>
+                <w:szCs w:val="18"/>
+                <w:lang w:val="en-US"/>
+              </w:rPr>
+              <w:t>&lt;!--</w:t>
+            </w:r>
+            <w:proofErr w:type="gramEnd"/>
+            <w:r>
+              <w:rPr>
+                <w:rFonts w:ascii="Courier New" w:eastAsia="Courier New" w:hAnsi="Courier New" w:cs="Courier New"/>
+                <w:color w:val="D4D4D4"/>
+                <w:sz w:val="18"/>
+                <w:szCs w:val="18"/>
+                <w:lang w:val="en-US"/>
+              </w:rPr>
+              <w:t xml:space="preserve"> Bootstrap JS --&gt;</w:t>
             </w:r>
           </w:p>
           <w:p>
@@ -15657,16 +15808,16 @@
                 <w:noProof/>
               </w:rPr>
               <w:drawing>
-                <wp:anchor distT="0" distB="0" distL="114300" distR="114300" simplePos="0" relativeHeight="251669504" behindDoc="0" locked="0" layoutInCell="1" allowOverlap="1" wp14:anchorId="783D5079" wp14:editId="7314825A">
+                <wp:anchor distT="0" distB="0" distL="114300" distR="114300" simplePos="0" relativeHeight="251669504" behindDoc="0" locked="0" layoutInCell="1" allowOverlap="1" wp14:anchorId="783D5079" wp14:editId="484C2849">
                   <wp:simplePos x="0" y="0"/>
                   <wp:positionH relativeFrom="column">
-                    <wp:posOffset>385445</wp:posOffset>
+                    <wp:posOffset>516890</wp:posOffset>
                   </wp:positionH>
                   <wp:positionV relativeFrom="paragraph">
-                    <wp:posOffset>-649605</wp:posOffset>
+                    <wp:posOffset>55245</wp:posOffset>
                   </wp:positionV>
-                  <wp:extent cx="5039995" cy="2167255"/>
-                  <wp:effectExtent l="0" t="0" r="8255" b="4445"/>
+                  <wp:extent cx="4648200" cy="1998345"/>
+                  <wp:effectExtent l="0" t="0" r="0" b="1905"/>
                   <wp:wrapNone/>
                   <wp:docPr id="1173263033" name="Picture 3"/>
                   <wp:cNvGraphicFramePr>
@@ -15694,7 +15845,7 @@
                         <pic:spPr>
                           <a:xfrm>
                             <a:off x="0" y="0"/>
-                            <a:ext cx="5039995" cy="2167255"/>
+                            <a:ext cx="4648200" cy="1998345"/>
                           </a:xfrm>
                           <a:prstGeom prst="rect">
                             <a:avLst/>

</xml_diff>